<commit_message>
Dining-room buyouts (no private room), favicon, dish pages, sticky menu nav, hero flip, 2001, since prior sync
Co-Authored-By: Claude Opus 4.8 <noreply@anthropic.com>
</commit_message>
<xml_diff>
--- a/OWNER-QA.docx
+++ b/OWNER-QA.docx
@@ -401,7 +401,18 @@
         <w:pStyle w:val="Heading2"/>
       </w:pPr>
       <w:r>
-        <w:t xml:space="preserve">3. Private room &amp; private events</w:t>
+        <w:t xml:space="preserve">3. Private events &amp; dining-room buyouts</w:t>
+      </w:r>
+    </w:p>
+    <w:p>
+      <w:pPr>
+        <w:pStyle w:val="Normal"/>
+      </w:pPr>
+      <w:r>
+        <w:rPr>
+          <w:i/>
+        </w:rPr>
+        <w:t xml:space="preserve">(You don't have a separate private room — the site now says guests can buy out the main dining room for private events and large groups. These questions are about that.)</w:t>
       </w:r>
     </w:p>
     <w:p>
@@ -415,10 +426,10 @@
         <w:rPr>
           <w:b/>
         </w:rPr>
-        <w:t xml:space="preserve">Seated capacity</w:t>
-      </w:r>
-      <w:r>
-        <w:t xml:space="preserve"> — how many guests can the private room seat? ______</w:t>
+        <w:t xml:space="preserve">Buyout capacity</w:t>
+      </w:r>
+      <w:r>
+        <w:t xml:space="preserve"> — how many guests can you seat for a full dining-room buyout? ______</w:t>
       </w:r>
     </w:p>
     <w:p>
@@ -432,18 +443,18 @@
         <w:rPr>
           <w:b/>
         </w:rPr>
-        <w:t xml:space="preserve">Standing / reception capacity</w:t>
-      </w:r>
-      <w:r>
-        <w:t xml:space="preserve"> of the private room? ______</w:t>
-      </w:r>
-    </w:p>
-    <w:p>
-      <w:pPr>
-        <w:pStyle w:val="Normal"/>
-      </w:pPr>
-      <w:r>
-        <w:t xml:space="preserve">11. Does the private room have a </w:t>
+        <w:t xml:space="preserve">Largest group</w:t>
+      </w:r>
+      <w:r>
+        <w:t xml:space="preserve"> you can accommodate (seated, and reception/standing style)? ______</w:t>
+      </w:r>
+    </w:p>
+    <w:p>
+      <w:pPr>
+        <w:pStyle w:val="Normal"/>
+      </w:pPr>
+      <w:r>
+        <w:t xml:space="preserve">11. Do you have a </w:t>
       </w:r>
       <w:r>
         <w:rPr>
@@ -452,7 +463,7 @@
         <w:t xml:space="preserve">TV or screen</w:t>
       </w:r>
       <w:r>
-        <w:t xml:space="preserve"> for slideshows/toasts? (yes / no) ______</w:t>
+        <w:t xml:space="preserve"> for slideshows/toasts at events? (yes / no) ______</w:t>
       </w:r>
     </w:p>
     <w:p>
@@ -469,7 +480,7 @@
         <w:t xml:space="preserve">Prix-fixe menu price</w:t>
       </w:r>
       <w:r>
-        <w:t xml:space="preserve"> — starting price per guest for a set menu in the private room? From $______ per guest</w:t>
+        <w:t xml:space="preserve"> — starting price per guest for a set event menu? From $______ per guest</w:t>
       </w:r>
     </w:p>
     <w:p>
@@ -483,10 +494,10 @@
         <w:rPr>
           <w:b/>
         </w:rPr>
-        <w:t xml:space="preserve">Room fee</w:t>
-      </w:r>
-      <w:r>
-        <w:t xml:space="preserve"> — is there a fee to use the private room? (no fee / $______)</w:t>
+        <w:t xml:space="preserve">Buyout food-and-drink minimum</w:t>
+      </w:r>
+      <w:r>
+        <w:t xml:space="preserve"> — is there one, and does it differ by day/weekend? (none / $______ ) ______</w:t>
       </w:r>
     </w:p>
     <w:p>
@@ -500,10 +511,10 @@
         <w:rPr>
           <w:b/>
         </w:rPr>
-        <w:t xml:space="preserve">Food &amp; drink minimum</w:t>
-      </w:r>
-      <w:r>
-        <w:t xml:space="preserve"> — is there a minimum spend? (none / $______ , and does it differ on weekends? ______)</w:t>
+        <w:t xml:space="preserve">When can you host buyouts?</w:t>
+      </w:r>
+      <w:r>
+        <w:t xml:space="preserve"> Any days/times you can (or can't) do a full buyout? ______</w:t>
       </w:r>
     </w:p>
     <w:p>

</xml_diff>